<commit_message>
Rewrite whole AI CRM landing page content with an AI angle (HTML, standalone preview, doc)
Co-Authored-By: Claude Sonnet 5.5 <noreply@anthropic.com>
Claude-Session: https://claude.ai/code/session_01EvNjF6Z24XTpLixWRFRe99
</commit_message>
<xml_diff>
--- a/crm-page/ai-crm-landing-page-content.docx
+++ b/crm-page/ai-crm-landing-page-content.docx
@@ -21,7 +21,7 @@
           <w:color w:val="5B6773"/>
           <w:sz w:val="18"/>
         </w:rPr>
-        <w:t>Updated content for https://hamtinfotech.com/lp/custom-crm-software-provider-in-dubai-uae/ for the AI CRM campaign. Sections marked CHANGED are rewritten for AI-based CRM software solutions. Sections marked UNCHANGED are copied word for word from the live page. CRM Types and CRM Reimplementation are removed.</w:t>
+        <w:t>Updated content for https://hamtinfotech.com/lp/custom-crm-software-provider-in-dubai-uae/ for the AI CRM campaign. Every section is rewritten with an AI angle for AI-based CRM software solutions. CRM Types and CRM Reimplementation are removed. Facts about the AI come only from the SugarAI CRM page.</w:t>
       </w:r>
     </w:p>
     <w:p>
@@ -950,7 +950,7 @@
                 <w:color w:val="0A1F33"/>
                 <w:sz w:val="18"/>
               </w:rPr>
-              <w:t>UNCHANGED</w:t>
+              <w:t>CHANGED</w:t>
             </w:r>
           </w:p>
         </w:tc>
@@ -980,7 +980,7 @@
                 <w:color w:val="0A1F33"/>
                 <w:sz w:val="18"/>
               </w:rPr>
-              <w:t>Copied from the live page.</w:t>
+              <w:t>Retitled and all five cards rewritten with AI lead scoring, forecasting and summaries.</w:t>
             </w:r>
           </w:p>
         </w:tc>
@@ -1075,7 +1075,7 @@
                 <w:color w:val="0A1F33"/>
                 <w:sz w:val="18"/>
               </w:rPr>
-              <w:t>General features replaced with six AI features. Heading and intro added.</w:t>
+              <w:t>General features replaced with six AI features.</w:t>
             </w:r>
           </w:p>
         </w:tc>
@@ -1140,7 +1140,7 @@
                 <w:color w:val="0A1F33"/>
                 <w:sz w:val="18"/>
               </w:rPr>
-              <w:t>UNCHANGED</w:t>
+              <w:t>CHANGED</w:t>
             </w:r>
           </w:p>
         </w:tc>
@@ -1170,7 +1170,7 @@
                 <w:color w:val="0A1F33"/>
                 <w:sz w:val="18"/>
               </w:rPr>
-              <w:t>Copied from the live page.</w:t>
+              <w:t>Reworded for an AI CRM.</w:t>
             </w:r>
           </w:p>
         </w:tc>
@@ -1360,7 +1360,7 @@
                 <w:color w:val="0A1F33"/>
                 <w:sz w:val="18"/>
               </w:rPr>
-              <w:t>Section and its CTA ("Is Your Current CRM Holding Your Team Back?") removed.</w:t>
+              <w:t>Section and its CTA removed.</w:t>
             </w:r>
           </w:p>
         </w:tc>
@@ -1455,7 +1455,7 @@
                 <w:color w:val="0A1F33"/>
                 <w:sz w:val="18"/>
               </w:rPr>
-              <w:t>Retitled for enterprise CRM, AI-focused copy, and a text paste error in the Cloud card fixed.</w:t>
+              <w:t>Retitled for enterprise CRM, AI-focused copy, paste error in Cloud card fixed.</w:t>
             </w:r>
           </w:p>
         </w:tc>
@@ -1520,7 +1520,7 @@
                 <w:color w:val="0A1F33"/>
                 <w:sz w:val="18"/>
               </w:rPr>
-              <w:t>UNCHANGED</w:t>
+              <w:t>CHANGED</w:t>
             </w:r>
           </w:p>
         </w:tc>
@@ -1550,7 +1550,7 @@
                 <w:color w:val="0A1F33"/>
                 <w:sz w:val="18"/>
               </w:rPr>
-              <w:t>Copied from the live page.</w:t>
+              <w:t>Heading, both delivery paths and all six steps reworded to include AI setup and adoption.</w:t>
             </w:r>
           </w:p>
         </w:tc>
@@ -1615,7 +1615,7 @@
                 <w:color w:val="0A1F33"/>
                 <w:sz w:val="18"/>
               </w:rPr>
-              <w:t>UNCHANGED</w:t>
+              <w:t>CHANGED</w:t>
             </w:r>
           </w:p>
         </w:tc>
@@ -1645,7 +1645,7 @@
                 <w:color w:val="0A1F33"/>
                 <w:sz w:val="18"/>
               </w:rPr>
-              <w:t>Copied from the live page.</w:t>
+              <w:t>Intro and all 12 card backs reworded with an AI angle. Taglines unchanged.</w:t>
             </w:r>
           </w:p>
         </w:tc>
@@ -1710,7 +1710,7 @@
                 <w:color w:val="0A1F33"/>
                 <w:sz w:val="18"/>
               </w:rPr>
-              <w:t>UNCHANGED</w:t>
+              <w:t>CHANGED</w:t>
             </w:r>
           </w:p>
         </w:tc>
@@ -1740,7 +1740,7 @@
                 <w:color w:val="0A1F33"/>
                 <w:sz w:val="18"/>
               </w:rPr>
-              <w:t>Copied from the live page.</w:t>
+              <w:t>Reworded for an AI CRM.</w:t>
             </w:r>
           </w:p>
         </w:tc>
@@ -1805,7 +1805,7 @@
                 <w:color w:val="0A1F33"/>
                 <w:sz w:val="18"/>
               </w:rPr>
-              <w:t>UNCHANGED</w:t>
+              <w:t>CHANGED</w:t>
             </w:r>
           </w:p>
         </w:tc>
@@ -1835,7 +1835,7 @@
                 <w:color w:val="0A1F33"/>
                 <w:sz w:val="18"/>
               </w:rPr>
-              <w:t>Copied from the live page.</w:t>
+              <w:t>Heading and points reworded around AI.</w:t>
             </w:r>
           </w:p>
         </w:tc>
@@ -1900,7 +1900,7 @@
                 <w:color w:val="0A1F33"/>
                 <w:sz w:val="18"/>
               </w:rPr>
-              <w:t>UNCHANGED + 2 optional</w:t>
+              <w:t>CHANGED</w:t>
             </w:r>
           </w:p>
         </w:tc>
@@ -1930,7 +1930,7 @@
                 <w:color w:val="0A1F33"/>
                 <w:sz w:val="18"/>
               </w:rPr>
-              <w:t>Seven live FAQs kept. Two AI FAQs suggested at the top for keyword coverage.</w:t>
+              <w:t>All nine questions are AI-focused, including two new AI questions at the top.</w:t>
             </w:r>
           </w:p>
         </w:tc>
@@ -2235,7 +2235,7 @@
         <w:keepNext/>
       </w:pPr>
       <w:r>
-        <w:t>3. Our CRM Offerings (UNCHANGED)</w:t>
+        <w:t>3. Our CRM Offerings (CHANGED)</w:t>
       </w:r>
     </w:p>
     <w:p>
@@ -2261,7 +2261,7 @@
           <w:color w:val="0A1F33"/>
           <w:sz w:val="20"/>
         </w:rPr>
-        <w:t>Our CRM Offerings</w:t>
+        <w:t>Our AI CRM Offerings</w:t>
       </w:r>
     </w:p>
     <w:p>
@@ -2287,7 +2287,7 @@
           <w:color w:val="0A1F33"/>
           <w:sz w:val="20"/>
         </w:rPr>
-        <w:t>Our CRM services in the UAE cover the full life of a CRM, whether you are choosing one for the first time or fixing one that is not working. Everything is built on SugarAI or a custom-made CRM and delivered by one team, so nothing gets lost between consultants, developers and support. Take one service or combine several. Each is described below.</w:t>
+        <w:t>Our AI-based CRM services in the UAE cover the full life of an AI CRM, whether you are choosing one for the first time or getting more from one you already own. Everything is built on SugarAI or a custom-made CRM and delivered by one team, so nothing gets lost between consultants, developers and support. Take one service or combine several.</w:t>
       </w:r>
     </w:p>
     <w:p>
@@ -2416,7 +2416,7 @@
                 <w:color w:val="0A1F33"/>
                 <w:sz w:val="18"/>
               </w:rPr>
-              <w:t>CRM Implementation &amp; Deployment</w:t>
+              <w:t>AI CRM Implementation &amp; Deployment</w:t>
             </w:r>
           </w:p>
         </w:tc>
@@ -2446,7 +2446,7 @@
                 <w:color w:val="0A1F33"/>
                 <w:sz w:val="18"/>
               </w:rPr>
-              <w:t>CRM implementation in the UAE starts with your sales stages, not a blank screen. We configure CRM software, move in your key data and train your users. Go live fast with a Jump Start package, then add more as you grow, on cloud, private cloud or your own servers.</w:t>
+              <w:t>AI CRM implementation in the UAE starts with your sales stages, not a blank screen. We configure the platform, switch on AI lead scoring and forecasting, move in your key data and train your users. Go live fast with a Jump Start package, on cloud, private cloud or your own servers.</w:t>
             </w:r>
           </w:p>
         </w:tc>
@@ -2481,7 +2481,7 @@
                 <w:color w:val="0A1F33"/>
                 <w:sz w:val="18"/>
               </w:rPr>
-              <w:t>Tailored CRM Development</w:t>
+              <w:t>Tailored AI CRM Development</w:t>
             </w:r>
           </w:p>
         </w:tc>
@@ -2511,7 +2511,7 @@
                 <w:color w:val="0A1F33"/>
                 <w:sz w:val="18"/>
               </w:rPr>
-              <w:t>When a standard screen does not fit your process, we build what does. Our CRM development in the UAE adds custom fields, modules and plugins so your team finds the data it needs in one place and responds faster.</w:t>
+              <w:t>When a standard screen does not fit your process, we build what does. Our CRM development in the UAE adds custom fields, modules and plugins, and shapes AI scoring and summaries around the way your team really sells.</w:t>
             </w:r>
           </w:p>
         </w:tc>
@@ -2546,7 +2546,7 @@
                 <w:color w:val="0A1F33"/>
                 <w:sz w:val="18"/>
               </w:rPr>
-              <w:t>CRM Integration</w:t>
+              <w:t>AI CRM Integration</w:t>
             </w:r>
           </w:p>
         </w:tc>
@@ -2576,7 +2576,7 @@
                 <w:color w:val="0A1F33"/>
                 <w:sz w:val="18"/>
               </w:rPr>
-              <w:t>CRM integration in the UAE links your custom-made CRM with your ERP, finance system, website and marketing tools. Quotes, orders and invoices appear on the customer record without anyone typing them twice.</w:t>
+              <w:t>CRM integration in the UAE links your AI CRM with your ERP, finance system, website and marketing tools. Quotes, orders and invoices land on the customer record, giving the AI complete data to score, forecast and summarise.</w:t>
             </w:r>
           </w:p>
         </w:tc>
@@ -2641,7 +2641,7 @@
                 <w:color w:val="0A1F33"/>
                 <w:sz w:val="18"/>
               </w:rPr>
-              <w:t>Already have a CRM that your team works around? We find what went wrong, reset the foundations and relaunch it properly. Moving from an existing CRM or spreadsheets? We clean and map your data and carry across the history that matters.</w:t>
+              <w:t>Already have a CRM that your team works around? We reset the foundations and relaunch it with AI built in. Moving from an existing CRM or spreadsheets? We clean and map your data, so AI scoring works on a trusted base.</w:t>
             </w:r>
           </w:p>
         </w:tc>
@@ -2676,7 +2676,7 @@
                 <w:color w:val="0A1F33"/>
                 <w:sz w:val="18"/>
               </w:rPr>
-              <w:t>CRM Consulting &amp; Evaluation</w:t>
+              <w:t>AI CRM Consulting &amp; Evaluation</w:t>
             </w:r>
           </w:p>
         </w:tc>
@@ -2706,7 +2706,7 @@
                 <w:color w:val="0A1F33"/>
                 <w:sz w:val="18"/>
               </w:rPr>
-              <w:t>Not sure which CRM to buy? Our CRM consulting in the UAE gives independent advice on platform choice, licensing and how your teams should work in it, before you commit to a project.</w:t>
+              <w:t>Not sure which AI CRM to buy? Our CRM consulting in the UAE gives independent advice on platform choice, licensing, AI readiness and how your teams should work in it, before you commit to a project.</w:t>
             </w:r>
           </w:p>
         </w:tc>
@@ -3302,7 +3302,7 @@
         <w:keepNext/>
       </w:pPr>
       <w:r>
-        <w:t>5. Mid-page CTA 1 (UNCHANGED)</w:t>
+        <w:t>5. Mid-page CTA 1 (CHANGED)</w:t>
       </w:r>
     </w:p>
     <w:p>
@@ -3328,7 +3328,7 @@
           <w:color w:val="0A1F33"/>
           <w:sz w:val="20"/>
         </w:rPr>
-        <w:t>Not Sure Which CRM Setup Fits Your Business?</w:t>
+        <w:t>Not Sure Which AI CRM Setup Fits Your Business?</w:t>
       </w:r>
     </w:p>
     <w:p>
@@ -3354,7 +3354,7 @@
           <w:color w:val="0A1F33"/>
           <w:sz w:val="20"/>
         </w:rPr>
-        <w:t>Tell us how your team sells and serves today. We will suggest the right route, ready-made or custom-made CRM, and what it would take to get started.</w:t>
+        <w:t>Tell us how your team sells and serves today. We will suggest the right route, ready-made or custom-made AI CRM, and what it would take to get started.</w:t>
       </w:r>
     </w:p>
     <w:p>
@@ -3687,7 +3687,7 @@
         <w:keepNext/>
       </w:pPr>
       <w:r>
-        <w:t>7. How We Deliver Your CRM (UNCHANGED)</w:t>
+        <w:t>7. How We Deliver Your AI CRM (CHANGED)</w:t>
       </w:r>
     </w:p>
     <w:p>
@@ -3713,7 +3713,7 @@
           <w:color w:val="0A1F33"/>
           <w:sz w:val="20"/>
         </w:rPr>
-        <w:t>How We Deliver Your CRM</w:t>
+        <w:t>How We Deliver Your AI CRM</w:t>
       </w:r>
     </w:p>
     <w:p>
@@ -3739,7 +3739,7 @@
           <w:color w:val="0A1F33"/>
           <w:sz w:val="20"/>
         </w:rPr>
-        <w:t>You choose the pace. Some teams want a working system fast, others need a carefully phased program. Either way, scope and timelines are agreed before work begins.</w:t>
+        <w:t>You choose the pace. Some teams want a working AI CRM fast, others need a carefully phased program. Either way, scope and timelines are agreed before work begins.</w:t>
       </w:r>
     </w:p>
     <w:p>
@@ -3893,7 +3893,7 @@
                 <w:color w:val="0A1F33"/>
                 <w:sz w:val="18"/>
               </w:rPr>
-              <w:t>Use the best practices already built into SugarAI CRM instead of a long services project. We provision a working system on day one and give you a dedicated Onboarding Advisor. Your team learns the system as it goes live, so ownership comes naturally.</w:t>
+              <w:t>Use the AI features and best practices already built into SugarAI instead of a long services project. We provision a working system on day one and give you a dedicated Onboarding Advisor. Your team learns the AI as it goes live, so ownership comes naturally.</w:t>
             </w:r>
           </w:p>
         </w:tc>
@@ -3958,7 +3958,7 @@
                 <w:color w:val="0A1F33"/>
                 <w:sz w:val="18"/>
               </w:rPr>
-              <w:t>For larger groups with several entities, ERP integration and heavy customization, we work in phases. Each phase has agreed scope, a named engagement lead and clear sign-offs, so everyone knows what is coming next.</w:t>
+              <w:t>For larger groups with several entities, ERP integration and heavy customization, we work in phases. Each phase has agreed scope, a named engagement lead and clear sign-offs, and AI features are switched on as your data and teams are ready.</w:t>
             </w:r>
           </w:p>
         </w:tc>
@@ -4013,7 +4013,7 @@
           <w:color w:val="0A1F33"/>
           <w:sz w:val="20"/>
         </w:rPr>
-        <w:t>We sit with your sales, service and management teams to understand how you work today and what is holding you back.</w:t>
+        <w:t>We sit with your sales, service and management teams to understand how you work today and where AI can save the most time.</w:t>
       </w:r>
     </w:p>
     <w:p>
@@ -4039,7 +4039,7 @@
           <w:color w:val="0A1F33"/>
           <w:sz w:val="20"/>
         </w:rPr>
-        <w:t>We agree what will be built, in what order and by when, before any work starts.</w:t>
+        <w:t>We agree what will be built, in what order and by when, including which AI features go live first.</w:t>
       </w:r>
     </w:p>
     <w:p>
@@ -4065,7 +4065,7 @@
           <w:color w:val="0A1F33"/>
           <w:sz w:val="20"/>
         </w:rPr>
-        <w:t>We set up your custom-made CRM, build custom modules where needed and set up your workflows, dashboards and reports.</w:t>
+        <w:t>We set up your AI CRM, build custom modules where needed and configure scoring, forecasts, workflows and dashboards.</w:t>
       </w:r>
     </w:p>
     <w:p>
@@ -4091,7 +4091,7 @@
           <w:color w:val="0A1F33"/>
           <w:sz w:val="20"/>
         </w:rPr>
-        <w:t>We connect your ERP and other systems and move your existing data across, cleaned and checked.</w:t>
+        <w:t>We connect your ERP and other systems and move your existing data across, cleaned and checked so the AI starts from a trusted base.</w:t>
       </w:r>
     </w:p>
     <w:p>
@@ -4117,7 +4117,7 @@
           <w:color w:val="0A1F33"/>
           <w:sz w:val="20"/>
         </w:rPr>
-        <w:t>We train each group of users and launch, in stages if you prefer, so early feedback improves the system.</w:t>
+        <w:t>We train each group of users on the AI features and launch, in stages if you prefer, so early feedback improves the system.</w:t>
       </w:r>
     </w:p>
     <w:p>
@@ -4157,7 +4157,7 @@
         <w:keepNext/>
       </w:pPr>
       <w:r>
-        <w:t>8. Industry Focus (UNCHANGED)</w:t>
+        <w:t>8. Industry Focus (CHANGED)</w:t>
       </w:r>
     </w:p>
     <w:p>
@@ -4235,7 +4235,7 @@
           <w:color w:val="0A1F33"/>
           <w:sz w:val="20"/>
         </w:rPr>
-        <w:t>Every industry has its own sales stages, fields and reports. We begin from an industry blueprint and then fit it to your business, so your team does not start from a blank screen.</w:t>
+        <w:t>Every industry has its own sales stages, fields and reports. We begin from an industry blueprint, add AI scoring, forecasting and summaries where they help most, and fit it to your business, so your team does not start from a blank screen.</w:t>
       </w:r>
     </w:p>
     <w:p>
@@ -4311,7 +4311,7 @@
           <w:color w:val="0A1F33"/>
           <w:sz w:val="19"/>
         </w:rPr>
-        <w:t>Build accurate quotes from your product options, keep warranty and service history linked to the original sale, and see aftermarket revenue as clearly as new orders.</w:t>
+        <w:t>Build accurate quotes from your product options, keep warranty and service history on the original sale, and see aftermarket revenue as clearly as new orders. AI scores each opportunity and flags quotes losing momentum.</w:t>
       </w:r>
     </w:p>
     <w:p>
@@ -4374,7 +4374,7 @@
           <w:color w:val="0A1F33"/>
           <w:sz w:val="19"/>
         </w:rPr>
-        <w:t>Quote from real stock levels in your ERP, apply discount limits before a quote goes out, and see results by brand, territory and salesperson without waiting for month-end.</w:t>
+        <w:t>Quote from real stock levels in your ERP, apply discount limits before a quote goes out, and see results by brand, territory and salesperson. AI forecasting shows which deals are likely to close without waiting for month-end.</w:t>
       </w:r>
     </w:p>
     <w:p>
@@ -4437,7 +4437,7 @@
           <w:color w:val="0A1F33"/>
           <w:sz w:val="19"/>
         </w:rPr>
-        <w:t>Part numbers, prices and stock stay on one customer record, so quotes are quick and accurate. Warranty claims and repeat purchases stay linked to the original sale across channels.</w:t>
+        <w:t>Part numbers, prices and stock stay on one customer record, so quotes are quick and accurate. Warranty claims and repeat purchases stay linked to the original sale, and AI scoring points reps to the accounts most worth a call.</w:t>
       </w:r>
     </w:p>
     <w:p>
@@ -4500,7 +4500,7 @@
           <w:color w:val="0A1F33"/>
           <w:sz w:val="19"/>
         </w:rPr>
-        <w:t>Schedule engineers by skill, location and SLA. They get job details, asset history and checklists on their phone, and capture parts, photos and the customer signature on site.</w:t>
+        <w:t>Schedule engineers by skill, location and SLA. They get job details, asset history and checklists on their phone, and capture parts, photos and the customer signature on site. AI-drafted account summaries give coordinators the full picture before every call.</w:t>
       </w:r>
     </w:p>
     <w:p>
@@ -4563,7 +4563,7 @@
           <w:color w:val="0A1F33"/>
           <w:sz w:val="19"/>
         </w:rPr>
-        <w:t>Enquiries from Bayut, Property Finder and your website reach the right agent within seconds, in the right language. Track units, bookings and broker commission through payment plan, handover and snagging.</w:t>
+        <w:t>Enquiries from Bayut, Property Finder and your website reach the right agent within seconds, in the right language, and AI scores each lead so agents call the most promising first. Track units, bookings and broker commission through payment plan, handover and snagging.</w:t>
       </w:r>
     </w:p>
     <w:p>
@@ -4626,7 +4626,7 @@
           <w:color w:val="0A1F33"/>
           <w:sz w:val="19"/>
         </w:rPr>
-        <w:t>See each customer group across its entities, facilities and relationship managers. Track credit pipelines, KYC renewals and reviews as scheduled work, hosted in your own environment where regulators require.</w:t>
+        <w:t>See each customer group across its entities, facilities and relationship managers. Track credit pipelines, KYC renewals and reviews as scheduled work, with AI summaries ready for every client review, hosted in your own environment where regulators require.</w:t>
       </w:r>
     </w:p>
     <w:p>
@@ -4689,7 +4689,7 @@
           <w:color w:val="0A1F33"/>
           <w:sz w:val="19"/>
         </w:rPr>
-        <w:t>Open renewal pipelines ninety days ahead instead of nine, compare broker and agent performance by line of business, and let the servicing team see claim status without calling the back office.</w:t>
+        <w:t>Open renewal pipelines ninety days ahead instead of nine, compare broker and agent performance by line of business, and let AI scoring and forecasting show which opportunities need attention first.</w:t>
       </w:r>
     </w:p>
     <w:p>
@@ -4752,7 +4752,7 @@
           <w:color w:val="0A1F33"/>
           <w:sz w:val="19"/>
         </w:rPr>
-        <w:t>Manage corporate accounts with real hierarchies and service at site level, quote multi-site contracts quickly and track tickets against agreed SLAs. Renewal risk shows before the contract date.</w:t>
+        <w:t>Manage corporate accounts with real hierarchies and service at site level, quote multi-site contracts quickly and track tickets against agreed SLAs. AI flags accounts and deals losing momentum before the contract date.</w:t>
       </w:r>
     </w:p>
     <w:p>
@@ -4815,7 +4815,7 @@
           <w:color w:val="0A1F33"/>
           <w:sz w:val="19"/>
         </w:rPr>
-        <w:t>Plan and record engagement with healthcare professionals, with consent captured at the point of contact. Track sample accountability and run GCC tenders as a managed pipeline with document control.</w:t>
+        <w:t>Plan and record engagement with healthcare professionals, with consent captured at the point of contact. Track sample accountability, run GCC tenders as a managed pipeline with document control, and let AI-drafted summaries prepare each meeting.</w:t>
       </w:r>
     </w:p>
     <w:p>
@@ -4878,7 +4878,7 @@
           <w:color w:val="0A1F33"/>
           <w:sz w:val="19"/>
         </w:rPr>
-        <w:t>Track donors, pledges and recurring giving, manage grant applications and milestones, coordinate volunteers and produce the reports trustees and funders expect at year end.</w:t>
+        <w:t>Track donors, pledges and recurring giving, manage grant applications and milestones, coordinate volunteers and produce the reports trustees and funders expect. AI-drafted summaries help teams prepare for every donor and funder conversation.</w:t>
       </w:r>
     </w:p>
     <w:p>
@@ -4941,7 +4941,7 @@
           <w:color w:val="0A1F33"/>
           <w:sz w:val="19"/>
         </w:rPr>
-        <w:t>Corporate accounts, event and group bookings and repeat-guest history sit beside your property management system. Returning guests are recognised, and preferences follow them across properties.</w:t>
+        <w:t>Corporate accounts, event and group bookings and repeat-guest history sit beside your property management system. Returning guests are recognised, preferences follow them across properties, and AI points sales teams to the accounts worth a call.</w:t>
       </w:r>
     </w:p>
     <w:p>
@@ -5004,7 +5004,7 @@
           <w:color w:val="0A1F33"/>
           <w:sz w:val="19"/>
         </w:rPr>
-        <w:t>Freight rates, bookings and container status sit against the customer account, so sales and operations see the same picture. Recurring lanes, contract rates and SLA performance show by customer, trade lane and mode.</w:t>
+        <w:t>Freight rates, bookings and container status sit against the customer account, so sales and operations see the same picture. Recurring lanes, contract rates and SLA performance show by customer, trade lane and mode, with AI forecasting for the pipeline.</w:t>
       </w:r>
     </w:p>
     <w:p>
@@ -5018,7 +5018,7 @@
         <w:keepNext/>
       </w:pPr>
       <w:r>
-        <w:t>9. Mid-page CTA 2 (UNCHANGED)</w:t>
+        <w:t>9. Mid-page CTA 2 (CHANGED)</w:t>
       </w:r>
     </w:p>
     <w:p>
@@ -5044,7 +5044,7 @@
           <w:color w:val="0A1F33"/>
           <w:sz w:val="20"/>
         </w:rPr>
-        <w:t>See How a CRM Would Work in Your Industry</w:t>
+        <w:t>See How an AI CRM Would Work in Your Industry</w:t>
       </w:r>
     </w:p>
     <w:p>
@@ -5070,7 +5070,7 @@
           <w:color w:val="0A1F33"/>
           <w:sz w:val="20"/>
         </w:rPr>
-        <w:t>Tell us your sector and our team will walk you through the fields, stages and reports we would set up for you.</w:t>
+        <w:t>Tell us your sector and our team will walk you through the fields, stages, reports and AI features we would set up for you.</w:t>
       </w:r>
     </w:p>
     <w:p>
@@ -5110,7 +5110,7 @@
         <w:keepNext/>
       </w:pPr>
       <w:r>
-        <w:t>10. Why Choose HAMT Infotech (UNCHANGED)</w:t>
+        <w:t>10. Why Choose HAMT Infotech (CHANGED)</w:t>
       </w:r>
     </w:p>
     <w:p>
@@ -5162,7 +5162,7 @@
           <w:color w:val="0A1F33"/>
           <w:sz w:val="20"/>
         </w:rPr>
-        <w:t>Why Choose HAMT Infotech for CRM Solutions in the UAE?</w:t>
+        <w:t>Why Choose HAMT Infotech for AI CRM Solutions in the UAE?</w:t>
       </w:r>
     </w:p>
     <w:p>
@@ -5220,14 +5220,14 @@
           <w:color w:val="0A1F33"/>
           <w:sz w:val="20"/>
         </w:rPr>
-        <w:t xml:space="preserve">One Team for the Whole CRM  -  </w:t>
-      </w:r>
-      <w:r>
-        <w:rPr>
-          <w:color w:val="0A1F33"/>
-          <w:sz w:val="20"/>
-        </w:rPr>
-        <w:t>Discovery, design, configuration, development, data migration, ERP integration, training and support all come from one team, so you have one point of accountability.</w:t>
+        <w:t xml:space="preserve">One Team for the Whole AI CRM  -  </w:t>
+      </w:r>
+      <w:r>
+        <w:rPr>
+          <w:color w:val="0A1F33"/>
+          <w:sz w:val="20"/>
+        </w:rPr>
+        <w:t>Discovery, design, configuration, development, data migration, ERP integration, AI setup, training and support all come from one team, so you have one point of accountability.</w:t>
       </w:r>
     </w:p>
     <w:p>
@@ -5253,7 +5253,7 @@
           <w:color w:val="0A1F33"/>
           <w:sz w:val="20"/>
         </w:rPr>
-        <w:t>We work with SugarAI every day, including its AI features, and we know where to stay close to standard and where a custom build is worth it.</w:t>
+        <w:t>We work with SugarAI every day, including its AI scoring, forecasting and summaries, and we know where to stay close to standard and where a custom build is worth it.</w:t>
       </w:r>
     </w:p>
     <w:p>
@@ -5279,7 +5279,7 @@
           <w:color w:val="0A1F33"/>
           <w:sz w:val="20"/>
         </w:rPr>
-        <w:t>A dedicated support team takes over at launch and works to the service levels in your contract, with a single service desk and regular reviews.</w:t>
+        <w:t>A dedicated support team takes over at launch and works to the service levels in your contract, with a single service desk and regular reviews as your AI and data mature.</w:t>
       </w:r>
     </w:p>
     <w:p>
@@ -5397,7 +5397,7 @@
           <w:color w:val="0A1F33"/>
           <w:sz w:val="20"/>
         </w:rPr>
-        <w:t>CRM Solutions UAE: Frequently Asked Questions</w:t>
+        <w:t>AI CRM Software: Frequently Asked Questions</w:t>
       </w:r>
     </w:p>
     <w:p>
@@ -5410,15 +5410,7 @@
           <w:color w:val="0A1F33"/>
           <w:sz w:val="20"/>
         </w:rPr>
-        <w:t>Single accordion, first item open. Two suggested AI FAQs first (NEW, optional), then the seven live FAQs unchanged:</w:t>
-      </w:r>
-    </w:p>
-    <w:p>
-      <w:pPr>
-        <w:pStyle w:val="Heading2"/>
-      </w:pPr>
-      <w:r>
-        <w:t>New, optional (AI keyword coverage)</w:t>
+        <w:t>Single accordion, first item open. Nine questions:</w:t>
       </w:r>
     </w:p>
     <w:p>
@@ -5493,14 +5485,6 @@
     </w:p>
     <w:p>
       <w:pPr>
-        <w:pStyle w:val="Heading2"/>
-      </w:pPr>
-      <w:r>
-        <w:t>Existing on the live page (unchanged)</w:t>
-      </w:r>
-    </w:p>
-    <w:p>
-      <w:pPr>
         <w:spacing w:after="40"/>
         <w:jc w:val="both"/>
       </w:pPr>
@@ -5518,7 +5502,7 @@
           <w:color w:val="0A1F33"/>
           <w:sz w:val="20"/>
         </w:rPr>
-        <w:t>What is a CRM, and why does a UAE business need one?</w:t>
+        <w:t>Why does a UAE business need an AI CRM?</w:t>
       </w:r>
     </w:p>
     <w:p>
@@ -5531,7 +5515,7 @@
           <w:color w:val="0A1F33"/>
           <w:sz w:val="20"/>
         </w:rPr>
-        <w:t>A CRM is software that keeps every customer interaction in one place, from the first enquiry to renewal and support. It helps your team follow up on time, see the full history of each customer and report on sales without spreadsheets. For UAE companies with many leads, channels and languages, it keeps everyone working from the same information.</w:t>
+        <w:t>A CRM keeps every customer interaction in one place. An AI CRM goes further: it scores leads, flags deals at risk and drafts summaries, so your team follows up on time and spends less effort on admin. For UAE companies with many leads, channels and languages, it keeps everyone working from the same information, with AI helping them decide what to do next.</w:t>
       </w:r>
     </w:p>
     <w:p>
@@ -5566,7 +5550,7 @@
           <w:color w:val="0A1F33"/>
           <w:sz w:val="20"/>
         </w:rPr>
-        <w:t>CRM software is the platform itself. CRM services are the work around it, such as consulting, implementation, customization, integration and support. A CRM solution is the finished result: the right software, set up, connected and supported to fit your business. HAMT Infotech provides all three.</w:t>
+        <w:t>CRM software is the platform itself. CRM services are the work around it, such as consulting, implementation, customization, integration and support. A CRM solution is the finished result: the right software with AI switched on, set up, connected and supported to fit your business. HAMT Infotech provides all three.</w:t>
       </w:r>
     </w:p>
     <w:p>
@@ -5671,7 +5655,7 @@
           <w:color w:val="0A1F33"/>
           <w:sz w:val="20"/>
         </w:rPr>
-        <w:t>Yes. CRM integration is a core part of our work. We connect SugarAI with ERP and finance platforms, your website, email and marketing tools, so quotes, orders and customer details move between systems automatically.</w:t>
+        <w:t>Yes. CRM integration is a core part of our work. We connect SugarAI with ERP and finance platforms, your website, email and marketing tools, so quotes, orders and customer details move between systems automatically and the AI works from complete data.</w:t>
       </w:r>
     </w:p>
     <w:p>
@@ -5706,7 +5690,7 @@
           <w:color w:val="0A1F33"/>
           <w:sz w:val="20"/>
         </w:rPr>
-        <w:t>Yes. We start from an industry blueprint with the fields, stages, reports and integrations your sector needs, then fit it to your business. Where your process is unusual, we build custom fields, modules and plugins inside SugarAI.</w:t>
+        <w:t>Yes. We start from an industry blueprint with the fields, stages, reports and integrations your sector needs, add AI scoring and forecasting where they help most, then fit it to your business. Where your process is unusual, we build custom fields, modules and plugins inside SugarAI.</w:t>
       </w:r>
     </w:p>
     <w:p>
@@ -5741,7 +5725,7 @@
           <w:color w:val="0A1F33"/>
           <w:sz w:val="20"/>
         </w:rPr>
-        <w:t>Yes. A dedicated support team takes over at go-live and works to the service levels in your contract. Requests go through a single service desk and are reviewed with you regularly.</w:t>
+        <w:t>Yes. A dedicated support team takes over at go-live and works to the service levels in your contract. Requests go through a single service desk and are reviewed with you regularly, and we help your team get more from the AI features as your data grows.</w:t>
       </w:r>
     </w:p>
     <w:p>

</xml_diff>

<commit_message>
Move Why Choose to the middle of the AI CRM landing page (HTML, preview, doc)
Co-Authored-By: Claude Sonnet 5.5 <noreply@anthropic.com>
Claude-Session: https://claude.ai/code/session_01EvNjF6Z24XTpLixWRFRe99
</commit_message>
<xml_diff>
--- a/crm-page/ai-crm-landing-page-content.docx
+++ b/crm-page/ai-crm-landing-page-content.docx
@@ -21,7 +21,7 @@
           <w:color w:val="5B6773"/>
           <w:sz w:val="18"/>
         </w:rPr>
-        <w:t>Restructured landing page for https://hamtinfotech.com/lp/custom-crm-software-provider-in-dubai-uae/ for the AI CRM campaign (keywords: AI CRM Software, Enterprise CRM Software, AI-powered Sales CRM). Section order follows a conversion-focused landing page: hero with form, trust strip, value, AI features, CTA, services, process, industries, CTA, deployment, why us, FAQ, closing CTA. The industry section now shows names only. FAQs are cut to six.</w:t>
+        <w:t>Restructured landing page for https://hamtinfotech.com/lp/custom-crm-software-provider-in-dubai-uae/ for the AI CRM campaign (keywords: AI CRM Software, Enterprise CRM Software, AI-powered Sales CRM). Section order follows a conversion-focused landing page: hero with form, trust strip, value, AI features, CTA, services, process, why us (centre of the page), industries, CTA, deployment, FAQ, closing CTA. The industry section now shows names only. FAQs are cut to six.</w:t>
       </w:r>
     </w:p>
     <w:p>
@@ -1732,7 +1732,7 @@
                 <w:color w:val="0A1F33"/>
                 <w:sz w:val="18"/>
               </w:rPr>
-              <w:t>Industry focus (names only)</w:t>
+              <w:t>Why choose us (centre of the page)</w:t>
             </w:r>
           </w:p>
         </w:tc>
@@ -1762,7 +1762,7 @@
                 <w:color w:val="0A1F33"/>
                 <w:sz w:val="18"/>
               </w:rPr>
-              <w:t>34</w:t>
+              <w:t>104</w:t>
             </w:r>
           </w:p>
         </w:tc>
@@ -1792,7 +1792,7 @@
                 <w:color w:val="0A1F33"/>
                 <w:sz w:val="18"/>
               </w:rPr>
-              <w:t>Show relevance</w:t>
+              <w:t>Reasons to pick HAMT, placed mid-page</w:t>
             </w:r>
           </w:p>
         </w:tc>
@@ -1857,7 +1857,7 @@
                 <w:color w:val="0A1F33"/>
                 <w:sz w:val="18"/>
               </w:rPr>
-              <w:t>Mid-page CTA 2</w:t>
+              <w:t>Industry focus (names only)</w:t>
             </w:r>
           </w:p>
         </w:tc>
@@ -1887,7 +1887,7 @@
                 <w:color w:val="0A1F33"/>
                 <w:sz w:val="18"/>
               </w:rPr>
-              <w:t>39</w:t>
+              <w:t>34</w:t>
             </w:r>
           </w:p>
         </w:tc>
@@ -1917,7 +1917,7 @@
                 <w:color w:val="0A1F33"/>
                 <w:sz w:val="18"/>
               </w:rPr>
-              <w:t>Convert industry-minded readers</w:t>
+              <w:t>Show relevance</w:t>
             </w:r>
           </w:p>
         </w:tc>
@@ -1982,7 +1982,7 @@
                 <w:color w:val="0A1F33"/>
                 <w:sz w:val="18"/>
               </w:rPr>
-              <w:t>Deployment options</w:t>
+              <w:t>Mid-page CTA 2</w:t>
             </w:r>
           </w:p>
         </w:tc>
@@ -2012,7 +2012,7 @@
                 <w:color w:val="0A1F33"/>
                 <w:sz w:val="18"/>
               </w:rPr>
-              <w:t>94</w:t>
+              <w:t>39</w:t>
             </w:r>
           </w:p>
         </w:tc>
@@ -2042,7 +2042,7 @@
                 <w:color w:val="0A1F33"/>
                 <w:sz w:val="18"/>
               </w:rPr>
-              <w:t>Answer the enterprise data question</w:t>
+              <w:t>Convert industry-minded readers</w:t>
             </w:r>
           </w:p>
         </w:tc>
@@ -2107,7 +2107,7 @@
                 <w:color w:val="0A1F33"/>
                 <w:sz w:val="18"/>
               </w:rPr>
-              <w:t>Why choose us</w:t>
+              <w:t>Deployment options</w:t>
             </w:r>
           </w:p>
         </w:tc>
@@ -2137,7 +2137,7 @@
                 <w:color w:val="0A1F33"/>
                 <w:sz w:val="18"/>
               </w:rPr>
-              <w:t>104</w:t>
+              <w:t>94</w:t>
             </w:r>
           </w:p>
         </w:tc>
@@ -2167,7 +2167,7 @@
                 <w:color w:val="0A1F33"/>
                 <w:sz w:val="18"/>
               </w:rPr>
-              <w:t>Reasons to pick HAMT</w:t>
+              <w:t>Answer the enterprise data question</w:t>
             </w:r>
           </w:p>
         </w:tc>
@@ -4862,7 +4862,7 @@
         <w:keepNext/>
       </w:pPr>
       <w:r>
-        <w:t>8. Industry Focus (names only)</w:t>
+        <w:t>8. Why Choose HAMT Infotech</w:t>
       </w:r>
     </w:p>
     <w:p>
@@ -4888,7 +4888,7 @@
           <w:color w:val="0A1F33"/>
           <w:sz w:val="20"/>
         </w:rPr>
-        <w:t>Industry Solutions</w:t>
+        <w:t>Why us</w:t>
       </w:r>
     </w:p>
     <w:p>
@@ -4914,7 +4914,20 @@
           <w:color w:val="0A1F33"/>
           <w:sz w:val="20"/>
         </w:rPr>
-        <w:t>OUR INDUSTRY FOCUS</w:t>
+        <w:t>Why Choose HAMT Infotech for AI CRM Solutions in the UAE?</w:t>
+      </w:r>
+    </w:p>
+    <w:p>
+      <w:pPr>
+        <w:spacing w:after="80"/>
+        <w:jc w:val="both"/>
+      </w:pPr>
+      <w:r>
+        <w:rPr>
+          <w:color w:val="0A1F33"/>
+          <w:sz w:val="20"/>
+        </w:rPr>
+        <w:t>Five points (heading / copy):</w:t>
       </w:r>
     </w:p>
     <w:p>
@@ -4933,80 +4946,14 @@
           <w:color w:val="0A1F33"/>
           <w:sz w:val="20"/>
         </w:rPr>
-        <w:t xml:space="preserve">Intro: </w:t>
-      </w:r>
-      <w:r>
-        <w:rPr>
-          <w:color w:val="0A1F33"/>
-          <w:sz w:val="20"/>
-        </w:rPr>
-        <w:t>AI CRM blueprints for 12 industries, fitted to your business.</w:t>
-      </w:r>
-    </w:p>
-    <w:p>
-      <w:pPr>
-        <w:spacing w:after="80"/>
-        <w:jc w:val="both"/>
-      </w:pPr>
-      <w:r>
-        <w:rPr>
-          <w:color w:val="0A1F33"/>
-          <w:sz w:val="20"/>
-        </w:rPr>
-        <w:t>Twelve tiles showing the industry name only. No taglines, descriptions, flip cards or hover text:</w:t>
-      </w:r>
-    </w:p>
-    <w:p>
-      <w:pPr>
-        <w:spacing w:after="40"/>
-        <w:jc w:val="both"/>
-      </w:pPr>
-      <w:r>
-        <w:rPr>
-          <w:color w:val="0A1F33"/>
-          <w:sz w:val="20"/>
-        </w:rPr>
-        <w:t>Manufacturing · Distribution · Retail &amp; Auto Parts · Field Service Management</w:t>
-      </w:r>
-    </w:p>
-    <w:p>
-      <w:pPr>
-        <w:spacing w:after="40"/>
-        <w:jc w:val="both"/>
-      </w:pPr>
-      <w:r>
-        <w:rPr>
-          <w:color w:val="0A1F33"/>
-          <w:sz w:val="20"/>
-        </w:rPr>
-        <w:t>Real Estate · Commercial Banking · Insurance · Telecom</w:t>
-      </w:r>
-    </w:p>
-    <w:p>
-      <w:pPr>
-        <w:spacing w:after="40"/>
-        <w:jc w:val="both"/>
-      </w:pPr>
-      <w:r>
-        <w:rPr>
-          <w:color w:val="0A1F33"/>
-          <w:sz w:val="20"/>
-        </w:rPr>
-        <w:t>Pharma · NGO &amp; Foundations · Hospitality · Logistics</w:t>
-      </w:r>
-    </w:p>
-    <w:p>
-      <w:pPr>
-        <w:spacing w:after="120"/>
-      </w:pPr>
-    </w:p>
-    <w:p>
-      <w:pPr>
-        <w:pStyle w:val="Heading1"/>
-        <w:keepNext/>
-      </w:pPr>
-      <w:r>
-        <w:t>9. Mid-page CTA 2</w:t>
+        <w:t xml:space="preserve">26 Years in the UAE and GCC  -  </w:t>
+      </w:r>
+      <w:r>
+        <w:rPr>
+          <w:color w:val="0A1F33"/>
+          <w:sz w:val="20"/>
+        </w:rPr>
+        <w:t>Advisors who understand how regional businesses operate, and engineers who build the systems they run on.</w:t>
       </w:r>
     </w:p>
     <w:p>
@@ -5025,14 +4972,14 @@
           <w:color w:val="0A1F33"/>
           <w:sz w:val="20"/>
         </w:rPr>
-        <w:t xml:space="preserve">H2: </w:t>
-      </w:r>
-      <w:r>
-        <w:rPr>
-          <w:color w:val="0A1F33"/>
-          <w:sz w:val="20"/>
-        </w:rPr>
-        <w:t>See How an AI CRM Would Work in Your Industry</w:t>
+        <w:t xml:space="preserve">One Team for the Whole AI CRM  -  </w:t>
+      </w:r>
+      <w:r>
+        <w:rPr>
+          <w:color w:val="0A1F33"/>
+          <w:sz w:val="20"/>
+        </w:rPr>
+        <w:t>Design, setup, integration, AI configuration, training and support from one accountable team.</w:t>
       </w:r>
     </w:p>
     <w:p>
@@ -5051,14 +4998,14 @@
           <w:color w:val="0A1F33"/>
           <w:sz w:val="20"/>
         </w:rPr>
-        <w:t xml:space="preserve">Body: </w:t>
-      </w:r>
-      <w:r>
-        <w:rPr>
-          <w:color w:val="0A1F33"/>
-          <w:sz w:val="20"/>
-        </w:rPr>
-        <w:t>Tell us your sector and our team will walk you through the fields, stages, reports and AI features we would set up for you.</w:t>
+        <w:t xml:space="preserve">SugarAI Expertise  -  </w:t>
+      </w:r>
+      <w:r>
+        <w:rPr>
+          <w:color w:val="0A1F33"/>
+          <w:sz w:val="20"/>
+        </w:rPr>
+        <w:t>We work with SugarAI every day, including its AI scoring, forecasting and summaries.</w:t>
       </w:r>
     </w:p>
     <w:p>
@@ -5077,14 +5024,40 @@
           <w:color w:val="0A1F33"/>
           <w:sz w:val="20"/>
         </w:rPr>
-        <w:t xml:space="preserve">Button: </w:t>
-      </w:r>
-      <w:r>
-        <w:rPr>
-          <w:color w:val="0A1F33"/>
-          <w:sz w:val="20"/>
-        </w:rPr>
-        <w:t>Talk to our CRM experts (scrolls to the hero form)</w:t>
+        <w:t xml:space="preserve">Support After Go-Live  -  </w:t>
+      </w:r>
+      <w:r>
+        <w:rPr>
+          <w:color w:val="0A1F33"/>
+          <w:sz w:val="20"/>
+        </w:rPr>
+        <w:t>A dedicated team, a single service desk and regular reviews as your AI and data mature.</w:t>
+      </w:r>
+    </w:p>
+    <w:p>
+      <w:pPr>
+        <w:pStyle w:val="ListParagraph"/>
+        <w:numPr>
+          <w:ilvl w:val="0"/>
+          <w:numId w:val="2"/>
+        </w:numPr>
+        <w:spacing w:after="120"/>
+        <w:jc w:val="both"/>
+      </w:pPr>
+      <w:r>
+        <w:rPr>
+          <w:b/>
+          <w:color w:val="0A1F33"/>
+          <w:sz w:val="20"/>
+        </w:rPr>
+        <w:t xml:space="preserve">Clear Scope and Timelines  -  </w:t>
+      </w:r>
+      <w:r>
+        <w:rPr>
+          <w:color w:val="0A1F33"/>
+          <w:sz w:val="20"/>
+        </w:rPr>
+        <w:t>Agreed before work starts, with a named engagement lead from kickoff to go-live.</w:t>
       </w:r>
     </w:p>
     <w:p>
@@ -5098,7 +5071,243 @@
         <w:keepNext/>
       </w:pPr>
       <w:r>
-        <w:t>10. Deployment Options</w:t>
+        <w:t>9. Industry Focus (names only)</w:t>
+      </w:r>
+    </w:p>
+    <w:p>
+      <w:pPr>
+        <w:pStyle w:val="ListParagraph"/>
+        <w:numPr>
+          <w:ilvl w:val="0"/>
+          <w:numId w:val="2"/>
+        </w:numPr>
+        <w:spacing w:after="120"/>
+        <w:jc w:val="both"/>
+      </w:pPr>
+      <w:r>
+        <w:rPr>
+          <w:b/>
+          <w:color w:val="0A1F33"/>
+          <w:sz w:val="20"/>
+        </w:rPr>
+        <w:t xml:space="preserve">Eyebrow: </w:t>
+      </w:r>
+      <w:r>
+        <w:rPr>
+          <w:color w:val="0A1F33"/>
+          <w:sz w:val="20"/>
+        </w:rPr>
+        <w:t>Industry Solutions</w:t>
+      </w:r>
+    </w:p>
+    <w:p>
+      <w:pPr>
+        <w:pStyle w:val="ListParagraph"/>
+        <w:numPr>
+          <w:ilvl w:val="0"/>
+          <w:numId w:val="2"/>
+        </w:numPr>
+        <w:spacing w:after="120"/>
+        <w:jc w:val="both"/>
+      </w:pPr>
+      <w:r>
+        <w:rPr>
+          <w:b/>
+          <w:color w:val="0A1F33"/>
+          <w:sz w:val="20"/>
+        </w:rPr>
+        <w:t xml:space="preserve">H2: </w:t>
+      </w:r>
+      <w:r>
+        <w:rPr>
+          <w:color w:val="0A1F33"/>
+          <w:sz w:val="20"/>
+        </w:rPr>
+        <w:t>OUR INDUSTRY FOCUS</w:t>
+      </w:r>
+    </w:p>
+    <w:p>
+      <w:pPr>
+        <w:pStyle w:val="ListParagraph"/>
+        <w:numPr>
+          <w:ilvl w:val="0"/>
+          <w:numId w:val="2"/>
+        </w:numPr>
+        <w:spacing w:after="120"/>
+        <w:jc w:val="both"/>
+      </w:pPr>
+      <w:r>
+        <w:rPr>
+          <w:b/>
+          <w:color w:val="0A1F33"/>
+          <w:sz w:val="20"/>
+        </w:rPr>
+        <w:t xml:space="preserve">Intro: </w:t>
+      </w:r>
+      <w:r>
+        <w:rPr>
+          <w:color w:val="0A1F33"/>
+          <w:sz w:val="20"/>
+        </w:rPr>
+        <w:t>AI CRM blueprints for 12 industries, fitted to your business.</w:t>
+      </w:r>
+    </w:p>
+    <w:p>
+      <w:pPr>
+        <w:spacing w:after="80"/>
+        <w:jc w:val="both"/>
+      </w:pPr>
+      <w:r>
+        <w:rPr>
+          <w:color w:val="0A1F33"/>
+          <w:sz w:val="20"/>
+        </w:rPr>
+        <w:t>Twelve tiles showing the industry name only. No taglines, descriptions, flip cards or hover text:</w:t>
+      </w:r>
+    </w:p>
+    <w:p>
+      <w:pPr>
+        <w:spacing w:after="40"/>
+        <w:jc w:val="both"/>
+      </w:pPr>
+      <w:r>
+        <w:rPr>
+          <w:color w:val="0A1F33"/>
+          <w:sz w:val="20"/>
+        </w:rPr>
+        <w:t>Manufacturing · Distribution · Retail &amp; Auto Parts · Field Service Management</w:t>
+      </w:r>
+    </w:p>
+    <w:p>
+      <w:pPr>
+        <w:spacing w:after="40"/>
+        <w:jc w:val="both"/>
+      </w:pPr>
+      <w:r>
+        <w:rPr>
+          <w:color w:val="0A1F33"/>
+          <w:sz w:val="20"/>
+        </w:rPr>
+        <w:t>Real Estate · Commercial Banking · Insurance · Telecom</w:t>
+      </w:r>
+    </w:p>
+    <w:p>
+      <w:pPr>
+        <w:spacing w:after="40"/>
+        <w:jc w:val="both"/>
+      </w:pPr>
+      <w:r>
+        <w:rPr>
+          <w:color w:val="0A1F33"/>
+          <w:sz w:val="20"/>
+        </w:rPr>
+        <w:t>Pharma · NGO &amp; Foundations · Hospitality · Logistics</w:t>
+      </w:r>
+    </w:p>
+    <w:p>
+      <w:pPr>
+        <w:spacing w:after="120"/>
+      </w:pPr>
+    </w:p>
+    <w:p>
+      <w:pPr>
+        <w:pStyle w:val="Heading1"/>
+        <w:keepNext/>
+      </w:pPr>
+      <w:r>
+        <w:t>10. Mid-page CTA 2</w:t>
+      </w:r>
+    </w:p>
+    <w:p>
+      <w:pPr>
+        <w:pStyle w:val="ListParagraph"/>
+        <w:numPr>
+          <w:ilvl w:val="0"/>
+          <w:numId w:val="2"/>
+        </w:numPr>
+        <w:spacing w:after="120"/>
+        <w:jc w:val="both"/>
+      </w:pPr>
+      <w:r>
+        <w:rPr>
+          <w:b/>
+          <w:color w:val="0A1F33"/>
+          <w:sz w:val="20"/>
+        </w:rPr>
+        <w:t xml:space="preserve">H2: </w:t>
+      </w:r>
+      <w:r>
+        <w:rPr>
+          <w:color w:val="0A1F33"/>
+          <w:sz w:val="20"/>
+        </w:rPr>
+        <w:t>See How an AI CRM Would Work in Your Industry</w:t>
+      </w:r>
+    </w:p>
+    <w:p>
+      <w:pPr>
+        <w:pStyle w:val="ListParagraph"/>
+        <w:numPr>
+          <w:ilvl w:val="0"/>
+          <w:numId w:val="2"/>
+        </w:numPr>
+        <w:spacing w:after="120"/>
+        <w:jc w:val="both"/>
+      </w:pPr>
+      <w:r>
+        <w:rPr>
+          <w:b/>
+          <w:color w:val="0A1F33"/>
+          <w:sz w:val="20"/>
+        </w:rPr>
+        <w:t xml:space="preserve">Body: </w:t>
+      </w:r>
+      <w:r>
+        <w:rPr>
+          <w:color w:val="0A1F33"/>
+          <w:sz w:val="20"/>
+        </w:rPr>
+        <w:t>Tell us your sector and our team will walk you through the fields, stages, reports and AI features we would set up for you.</w:t>
+      </w:r>
+    </w:p>
+    <w:p>
+      <w:pPr>
+        <w:pStyle w:val="ListParagraph"/>
+        <w:numPr>
+          <w:ilvl w:val="0"/>
+          <w:numId w:val="2"/>
+        </w:numPr>
+        <w:spacing w:after="120"/>
+        <w:jc w:val="both"/>
+      </w:pPr>
+      <w:r>
+        <w:rPr>
+          <w:b/>
+          <w:color w:val="0A1F33"/>
+          <w:sz w:val="20"/>
+        </w:rPr>
+        <w:t xml:space="preserve">Button: </w:t>
+      </w:r>
+      <w:r>
+        <w:rPr>
+          <w:color w:val="0A1F33"/>
+          <w:sz w:val="20"/>
+        </w:rPr>
+        <w:t>Talk to our CRM experts (scrolls to the hero form)</w:t>
+      </w:r>
+    </w:p>
+    <w:p>
+      <w:pPr>
+        <w:spacing w:after="120"/>
+      </w:pPr>
+    </w:p>
+    <w:p>
+      <w:pPr>
+        <w:pStyle w:val="Heading1"/>
+        <w:keepNext/>
+      </w:pPr>
+      <w:r>
+        <w:t>11. Deployment Options</w:t>
       </w:r>
     </w:p>
     <w:p>
@@ -5365,7 +5574,101 @@
         <w:keepNext/>
       </w:pPr>
       <w:r>
-        <w:t>11. Why Choose HAMT Infotech</w:t>
+        <w:t>12. Proof (to be supplied)</w:t>
+      </w:r>
+    </w:p>
+    <w:p>
+      <w:pPr>
+        <w:spacing w:after="80"/>
+        <w:jc w:val="both"/>
+      </w:pPr>
+      <w:r>
+        <w:rPr>
+          <w:color w:val="0A1F33"/>
+          <w:sz w:val="20"/>
+        </w:rPr>
+        <w:t>The page currently has no client proof. Add one of the following, using only real, approved material:</w:t>
+      </w:r>
+    </w:p>
+    <w:p>
+      <w:pPr>
+        <w:pStyle w:val="ListParagraph"/>
+        <w:numPr>
+          <w:ilvl w:val="0"/>
+          <w:numId w:val="2"/>
+        </w:numPr>
+        <w:spacing w:after="60"/>
+        <w:jc w:val="both"/>
+      </w:pPr>
+      <w:r>
+        <w:rPr>
+          <w:color w:val="0A1F33"/>
+          <w:sz w:val="20"/>
+        </w:rPr>
+        <w:t>Client logos (with permission)</w:t>
+      </w:r>
+    </w:p>
+    <w:p>
+      <w:pPr>
+        <w:pStyle w:val="ListParagraph"/>
+        <w:numPr>
+          <w:ilvl w:val="0"/>
+          <w:numId w:val="2"/>
+        </w:numPr>
+        <w:spacing w:after="60"/>
+        <w:jc w:val="both"/>
+      </w:pPr>
+      <w:r>
+        <w:rPr>
+          <w:color w:val="0A1F33"/>
+          <w:sz w:val="20"/>
+        </w:rPr>
+        <w:t>One short client testimonial with name, role and company</w:t>
+      </w:r>
+    </w:p>
+    <w:p>
+      <w:pPr>
+        <w:pStyle w:val="ListParagraph"/>
+        <w:numPr>
+          <w:ilvl w:val="0"/>
+          <w:numId w:val="2"/>
+        </w:numPr>
+        <w:spacing w:after="60"/>
+        <w:jc w:val="both"/>
+      </w:pPr>
+      <w:r>
+        <w:rPr>
+          <w:color w:val="0A1F33"/>
+          <w:sz w:val="20"/>
+        </w:rPr>
+        <w:t>One verifiable result, for example time saved or forecast accuracy, with its source</w:t>
+      </w:r>
+    </w:p>
+    <w:p>
+      <w:pPr>
+        <w:spacing w:after="80"/>
+        <w:jc w:val="both"/>
+      </w:pPr>
+      <w:r>
+        <w:rPr>
+          <w:color w:val="0A1F33"/>
+          <w:sz w:val="20"/>
+        </w:rPr>
+        <w:t>Suggested position: directly after Why Choose or just before the FAQ. No placeholder copy is written, so nothing unverified goes live.</w:t>
+      </w:r>
+    </w:p>
+    <w:p>
+      <w:pPr>
+        <w:spacing w:after="120"/>
+      </w:pPr>
+    </w:p>
+    <w:p>
+      <w:pPr>
+        <w:pStyle w:val="Heading1"/>
+        <w:keepNext/>
+      </w:pPr>
+      <w:r>
+        <w:t>13. FAQ</w:t>
       </w:r>
     </w:p>
     <w:p>
@@ -5384,14 +5687,251 @@
           <w:color w:val="0A1F33"/>
           <w:sz w:val="20"/>
         </w:rPr>
-        <w:t xml:space="preserve">Eyebrow: </w:t>
-      </w:r>
-      <w:r>
-        <w:rPr>
-          <w:color w:val="0A1F33"/>
-          <w:sz w:val="20"/>
-        </w:rPr>
-        <w:t>Why us</w:t>
+        <w:t xml:space="preserve">H2: </w:t>
+      </w:r>
+      <w:r>
+        <w:rPr>
+          <w:color w:val="0A1F33"/>
+          <w:sz w:val="20"/>
+        </w:rPr>
+        <w:t>AI CRM Software: Frequently Asked Questions</w:t>
+      </w:r>
+    </w:p>
+    <w:p>
+      <w:pPr>
+        <w:spacing w:after="80"/>
+        <w:jc w:val="both"/>
+      </w:pPr>
+      <w:r>
+        <w:rPr>
+          <w:color w:val="0A1F33"/>
+          <w:sz w:val="20"/>
+        </w:rPr>
+        <w:t>Single accordion, first item open. Six questions:</w:t>
+      </w:r>
+    </w:p>
+    <w:p>
+      <w:pPr>
+        <w:spacing w:after="40"/>
+        <w:jc w:val="both"/>
+      </w:pPr>
+      <w:r>
+        <w:rPr>
+          <w:b/>
+          <w:color w:val="0A1F33"/>
+          <w:sz w:val="20"/>
+        </w:rPr>
+        <w:t xml:space="preserve">Q: </w:t>
+      </w:r>
+      <w:r>
+        <w:rPr>
+          <w:b/>
+          <w:color w:val="0A1F33"/>
+          <w:sz w:val="20"/>
+        </w:rPr>
+        <w:t>What is AI CRM software, and how is it different from a standard CRM?</w:t>
+      </w:r>
+    </w:p>
+    <w:p>
+      <w:pPr>
+        <w:spacing w:after="100"/>
+        <w:jc w:val="both"/>
+      </w:pPr>
+      <w:r>
+        <w:rPr>
+          <w:color w:val="0A1F33"/>
+          <w:sz w:val="20"/>
+        </w:rPr>
+        <w:t>A standard CRM stores and organises customer data. AI CRM software also uses it: it scores leads, flags deals at risk, forecasts what will close, drafts account summaries and suggests the next best action.</w:t>
+      </w:r>
+    </w:p>
+    <w:p>
+      <w:pPr>
+        <w:spacing w:after="40"/>
+        <w:jc w:val="both"/>
+      </w:pPr>
+      <w:r>
+        <w:rPr>
+          <w:b/>
+          <w:color w:val="0A1F33"/>
+          <w:sz w:val="20"/>
+        </w:rPr>
+        <w:t xml:space="preserve">Q: </w:t>
+      </w:r>
+      <w:r>
+        <w:rPr>
+          <w:b/>
+          <w:color w:val="0A1F33"/>
+          <w:sz w:val="20"/>
+        </w:rPr>
+        <w:t>What AI features does an AI-powered sales CRM include?</w:t>
+      </w:r>
+    </w:p>
+    <w:p>
+      <w:pPr>
+        <w:spacing w:after="100"/>
+        <w:jc w:val="both"/>
+      </w:pPr>
+      <w:r>
+        <w:rPr>
+          <w:color w:val="0A1F33"/>
+          <w:sz w:val="20"/>
+        </w:rPr>
+        <w:t>Our AI-powered sales CRM on SugarAI includes lead and opportunity scoring trained on your own won and lost history, at-risk deal alerts, built-in forecasting, drafted summaries and meeting prep, and next-best-action guidance.</w:t>
+      </w:r>
+    </w:p>
+    <w:p>
+      <w:pPr>
+        <w:spacing w:after="40"/>
+        <w:jc w:val="both"/>
+      </w:pPr>
+      <w:r>
+        <w:rPr>
+          <w:b/>
+          <w:color w:val="0A1F33"/>
+          <w:sz w:val="20"/>
+        </w:rPr>
+        <w:t xml:space="preserve">Q: </w:t>
+      </w:r>
+      <w:r>
+        <w:rPr>
+          <w:b/>
+          <w:color w:val="0A1F33"/>
+          <w:sz w:val="20"/>
+        </w:rPr>
+        <w:t>What is SugarAI, and how is it different from Sugar CRM?</w:t>
+      </w:r>
+    </w:p>
+    <w:p>
+      <w:pPr>
+        <w:spacing w:after="100"/>
+        <w:jc w:val="both"/>
+      </w:pPr>
+      <w:r>
+        <w:rPr>
+          <w:color w:val="0A1F33"/>
+          <w:sz w:val="20"/>
+        </w:rPr>
+        <w:t>SugarAI is the intelligent evolution of Sugar CRM. It keeps the sales, service and marketing platform and adds built-in predictive AI that scores leads, flags at-risk deals and drafts account summaries automatically.</w:t>
+      </w:r>
+    </w:p>
+    <w:p>
+      <w:pPr>
+        <w:spacing w:after="40"/>
+        <w:jc w:val="both"/>
+      </w:pPr>
+      <w:r>
+        <w:rPr>
+          <w:b/>
+          <w:color w:val="0A1F33"/>
+          <w:sz w:val="20"/>
+        </w:rPr>
+        <w:t xml:space="preserve">Q: </w:t>
+      </w:r>
+      <w:r>
+        <w:rPr>
+          <w:b/>
+          <w:color w:val="0A1F33"/>
+          <w:sz w:val="20"/>
+        </w:rPr>
+        <w:t>Can SugarAI work if our customer data is incomplete?</w:t>
+      </w:r>
+    </w:p>
+    <w:p>
+      <w:pPr>
+        <w:spacing w:after="100"/>
+        <w:jc w:val="both"/>
+      </w:pPr>
+      <w:r>
+        <w:rPr>
+          <w:color w:val="0A1F33"/>
+          <w:sz w:val="20"/>
+        </w:rPr>
+        <w:t>Yes. SugarAI is built to give useful predictions from partial or ageing records, so you do not need a perfect database before you start.</w:t>
+      </w:r>
+    </w:p>
+    <w:p>
+      <w:pPr>
+        <w:spacing w:after="40"/>
+        <w:jc w:val="both"/>
+      </w:pPr>
+      <w:r>
+        <w:rPr>
+          <w:b/>
+          <w:color w:val="0A1F33"/>
+          <w:sz w:val="20"/>
+        </w:rPr>
+        <w:t xml:space="preserve">Q: </w:t>
+      </w:r>
+      <w:r>
+        <w:rPr>
+          <w:b/>
+          <w:color w:val="0A1F33"/>
+          <w:sz w:val="20"/>
+        </w:rPr>
+        <w:t>Can you connect the CRM to our ERP and other systems?</w:t>
+      </w:r>
+    </w:p>
+    <w:p>
+      <w:pPr>
+        <w:spacing w:after="100"/>
+        <w:jc w:val="both"/>
+      </w:pPr>
+      <w:r>
+        <w:rPr>
+          <w:color w:val="0A1F33"/>
+          <w:sz w:val="20"/>
+        </w:rPr>
+        <w:t>Yes. We connect SugarAI with ERP and finance platforms, your website, email and marketing tools, so data moves between systems automatically and the AI works from complete records.</w:t>
+      </w:r>
+    </w:p>
+    <w:p>
+      <w:pPr>
+        <w:spacing w:after="40"/>
+        <w:jc w:val="both"/>
+      </w:pPr>
+      <w:r>
+        <w:rPr>
+          <w:b/>
+          <w:color w:val="0A1F33"/>
+          <w:sz w:val="20"/>
+        </w:rPr>
+        <w:t xml:space="preserve">Q: </w:t>
+      </w:r>
+      <w:r>
+        <w:rPr>
+          <w:b/>
+          <w:color w:val="0A1F33"/>
+          <w:sz w:val="20"/>
+        </w:rPr>
+        <w:t>Can we keep our data in the UAE or on our own servers?</w:t>
+      </w:r>
+    </w:p>
+    <w:p>
+      <w:pPr>
+        <w:spacing w:after="100"/>
+        <w:jc w:val="both"/>
+      </w:pPr>
+      <w:r>
+        <w:rPr>
+          <w:color w:val="0A1F33"/>
+          <w:sz w:val="20"/>
+        </w:rPr>
+        <w:t>Yes. You can host on the cloud with regional hosting, deploy into your own Azure, AWS or Oracle Cloud subscription, or install on-premise in your own data centre. Groups often mix models, and it is the same product and team either way.</w:t>
+      </w:r>
+    </w:p>
+    <w:p>
+      <w:pPr>
+        <w:spacing w:after="120"/>
+      </w:pPr>
+    </w:p>
+    <w:p>
+      <w:pPr>
+        <w:pStyle w:val="Heading1"/>
+        <w:keepNext/>
+      </w:pPr>
+      <w:r>
+        <w:t>14. Closing CTA</w:t>
       </w:r>
     </w:p>
     <w:p>
@@ -5417,20 +5957,7 @@
           <w:color w:val="0A1F33"/>
           <w:sz w:val="20"/>
         </w:rPr>
-        <w:t>Why Choose HAMT Infotech for AI CRM Solutions in the UAE?</w:t>
-      </w:r>
-    </w:p>
-    <w:p>
-      <w:pPr>
-        <w:spacing w:after="80"/>
-        <w:jc w:val="both"/>
-      </w:pPr>
-      <w:r>
-        <w:rPr>
-          <w:color w:val="0A1F33"/>
-          <w:sz w:val="20"/>
-        </w:rPr>
-        <w:t>Five points (heading / copy):</w:t>
+        <w:t>Ready to See an AI CRM on Your Own Pipeline?</w:t>
       </w:r>
     </w:p>
     <w:p>
@@ -5449,14 +5976,14 @@
           <w:color w:val="0A1F33"/>
           <w:sz w:val="20"/>
         </w:rPr>
-        <w:t xml:space="preserve">26 Years in the UAE and GCC  -  </w:t>
-      </w:r>
-      <w:r>
-        <w:rPr>
-          <w:color w:val="0A1F33"/>
-          <w:sz w:val="20"/>
-        </w:rPr>
-        <w:t>Advisors who understand how regional businesses operate, and engineers who build the systems they run on.</w:t>
+        <w:t xml:space="preserve">Body: </w:t>
+      </w:r>
+      <w:r>
+        <w:rPr>
+          <w:color w:val="0A1F33"/>
+          <w:sz w:val="20"/>
+        </w:rPr>
+        <w:t>Book a free consultation and we will show you AI lead scoring, forecasting and summaries on your kind of data.</w:t>
       </w:r>
     </w:p>
     <w:p>
@@ -5475,14 +6002,14 @@
           <w:color w:val="0A1F33"/>
           <w:sz w:val="20"/>
         </w:rPr>
-        <w:t xml:space="preserve">One Team for the Whole AI CRM  -  </w:t>
-      </w:r>
-      <w:r>
-        <w:rPr>
-          <w:color w:val="0A1F33"/>
-          <w:sz w:val="20"/>
-        </w:rPr>
-        <w:t>Design, setup, integration, AI configuration, training and support from one accountable team.</w:t>
+        <w:t xml:space="preserve">Button: </w:t>
+      </w:r>
+      <w:r>
+        <w:rPr>
+          <w:color w:val="0A1F33"/>
+          <w:sz w:val="20"/>
+        </w:rPr>
+        <w:t>Book a free consultation (scrolls to the hero form)</w:t>
       </w:r>
     </w:p>
     <w:p>
@@ -5501,14 +6028,41 @@
           <w:color w:val="0A1F33"/>
           <w:sz w:val="20"/>
         </w:rPr>
-        <w:t xml:space="preserve">SugarAI Expertise  -  </w:t>
-      </w:r>
-      <w:r>
-        <w:rPr>
-          <w:color w:val="0A1F33"/>
-          <w:sz w:val="20"/>
-        </w:rPr>
-        <w:t>We work with SugarAI every day, including its AI scoring, forecasting and summaries.</w:t>
+        <w:t xml:space="preserve">Phone line: </w:t>
+      </w:r>
+      <w:r>
+        <w:rPr>
+          <w:color w:val="0A1F33"/>
+          <w:sz w:val="20"/>
+        </w:rPr>
+        <w:t>Or call us on +971 4 32 77 775 (tap-to-call)</w:t>
+      </w:r>
+    </w:p>
+    <w:p>
+      <w:pPr>
+        <w:spacing w:after="80"/>
+        <w:jc w:val="both"/>
+      </w:pPr>
+      <w:r>
+        <w:rPr>
+          <w:color w:val="0A1F33"/>
+          <w:sz w:val="20"/>
+        </w:rPr>
+        <w:t>Optional: add a short form here (Name, Email, Phone) using the site form component, so visitors at the bottom of the page can convert without scrolling back up.</w:t>
+      </w:r>
+    </w:p>
+    <w:p>
+      <w:pPr>
+        <w:spacing w:after="120"/>
+      </w:pPr>
+    </w:p>
+    <w:p>
+      <w:pPr>
+        <w:pStyle w:val="Heading1"/>
+        <w:keepNext/>
+      </w:pPr>
+      <w:r>
+        <w:t>15. What Changed and What Was Removed</w:t>
       </w:r>
     </w:p>
     <w:p>
@@ -5527,14 +6081,14 @@
           <w:color w:val="0A1F33"/>
           <w:sz w:val="20"/>
         </w:rPr>
-        <w:t xml:space="preserve">Support After Go-Live  -  </w:t>
-      </w:r>
-      <w:r>
-        <w:rPr>
-          <w:color w:val="0A1F33"/>
-          <w:sz w:val="20"/>
-        </w:rPr>
-        <w:t>A dedicated team, a single service desk and regular reviews as your AI and data mature.</w:t>
+        <w:t xml:space="preserve">Removed sections: </w:t>
+      </w:r>
+      <w:r>
+        <w:rPr>
+          <w:color w:val="0A1F33"/>
+          <w:sz w:val="20"/>
+        </w:rPr>
+        <w:t>CRM Types, CRM Reimplementation and its CTA, and the "CRM Types" navigation link.</w:t>
       </w:r>
     </w:p>
     <w:p>
@@ -5553,122 +6107,14 @@
           <w:color w:val="0A1F33"/>
           <w:sz w:val="20"/>
         </w:rPr>
-        <w:t xml:space="preserve">Clear Scope and Timelines  -  </w:t>
-      </w:r>
-      <w:r>
-        <w:rPr>
-          <w:color w:val="0A1F33"/>
-          <w:sz w:val="20"/>
-        </w:rPr>
-        <w:t>Agreed before work starts, with a named engagement lead from kickoff to go-live.</w:t>
-      </w:r>
-    </w:p>
-    <w:p>
-      <w:pPr>
-        <w:spacing w:after="120"/>
-      </w:pPr>
-    </w:p>
-    <w:p>
-      <w:pPr>
-        <w:pStyle w:val="Heading1"/>
-        <w:keepNext/>
-      </w:pPr>
-      <w:r>
-        <w:t>12. Proof (to be supplied)</w:t>
-      </w:r>
-    </w:p>
-    <w:p>
-      <w:pPr>
-        <w:spacing w:after="80"/>
-        <w:jc w:val="both"/>
-      </w:pPr>
-      <w:r>
-        <w:rPr>
-          <w:color w:val="0A1F33"/>
-          <w:sz w:val="20"/>
-        </w:rPr>
-        <w:t>The page currently has no client proof. Add one of the following, using only real, approved material:</w:t>
-      </w:r>
-    </w:p>
-    <w:p>
-      <w:pPr>
-        <w:pStyle w:val="ListParagraph"/>
-        <w:numPr>
-          <w:ilvl w:val="0"/>
-          <w:numId w:val="2"/>
-        </w:numPr>
-        <w:spacing w:after="60"/>
-        <w:jc w:val="both"/>
-      </w:pPr>
-      <w:r>
-        <w:rPr>
-          <w:color w:val="0A1F33"/>
-          <w:sz w:val="20"/>
-        </w:rPr>
-        <w:t>Client logos (with permission)</w:t>
-      </w:r>
-    </w:p>
-    <w:p>
-      <w:pPr>
-        <w:pStyle w:val="ListParagraph"/>
-        <w:numPr>
-          <w:ilvl w:val="0"/>
-          <w:numId w:val="2"/>
-        </w:numPr>
-        <w:spacing w:after="60"/>
-        <w:jc w:val="both"/>
-      </w:pPr>
-      <w:r>
-        <w:rPr>
-          <w:color w:val="0A1F33"/>
-          <w:sz w:val="20"/>
-        </w:rPr>
-        <w:t>One short client testimonial with name, role and company</w:t>
-      </w:r>
-    </w:p>
-    <w:p>
-      <w:pPr>
-        <w:pStyle w:val="ListParagraph"/>
-        <w:numPr>
-          <w:ilvl w:val="0"/>
-          <w:numId w:val="2"/>
-        </w:numPr>
-        <w:spacing w:after="60"/>
-        <w:jc w:val="both"/>
-      </w:pPr>
-      <w:r>
-        <w:rPr>
-          <w:color w:val="0A1F33"/>
-          <w:sz w:val="20"/>
-        </w:rPr>
-        <w:t>One verifiable result, for example time saved or forecast accuracy, with its source</w:t>
-      </w:r>
-    </w:p>
-    <w:p>
-      <w:pPr>
-        <w:spacing w:after="80"/>
-        <w:jc w:val="both"/>
-      </w:pPr>
-      <w:r>
-        <w:rPr>
-          <w:color w:val="0A1F33"/>
-          <w:sz w:val="20"/>
-        </w:rPr>
-        <w:t>Suggested position: between Why Choose and FAQ. No placeholder copy is written, so nothing unverified goes live.</w:t>
-      </w:r>
-    </w:p>
-    <w:p>
-      <w:pPr>
-        <w:spacing w:after="120"/>
-      </w:pPr>
-    </w:p>
-    <w:p>
-      <w:pPr>
-        <w:pStyle w:val="Heading1"/>
-        <w:keepNext/>
-      </w:pPr>
-      <w:r>
-        <w:t>13. FAQ</w:t>
+        <w:t xml:space="preserve">Industry section: </w:t>
+      </w:r>
+      <w:r>
+        <w:rPr>
+          <w:color w:val="0A1F33"/>
+          <w:sz w:val="20"/>
+        </w:rPr>
+        <w:t>Flip cards with descriptions replaced by plain name tiles with the same photos.</w:t>
       </w:r>
     </w:p>
     <w:p>
@@ -5687,251 +6133,14 @@
           <w:color w:val="0A1F33"/>
           <w:sz w:val="20"/>
         </w:rPr>
-        <w:t xml:space="preserve">H2: </w:t>
-      </w:r>
-      <w:r>
-        <w:rPr>
-          <w:color w:val="0A1F33"/>
-          <w:sz w:val="20"/>
-        </w:rPr>
-        <w:t>AI CRM Software: Frequently Asked Questions</w:t>
-      </w:r>
-    </w:p>
-    <w:p>
-      <w:pPr>
-        <w:spacing w:after="80"/>
-        <w:jc w:val="both"/>
-      </w:pPr>
-      <w:r>
-        <w:rPr>
-          <w:color w:val="0A1F33"/>
-          <w:sz w:val="20"/>
-        </w:rPr>
-        <w:t>Single accordion, first item open. Six questions:</w:t>
-      </w:r>
-    </w:p>
-    <w:p>
-      <w:pPr>
-        <w:spacing w:after="40"/>
-        <w:jc w:val="both"/>
-      </w:pPr>
-      <w:r>
-        <w:rPr>
-          <w:b/>
-          <w:color w:val="0A1F33"/>
-          <w:sz w:val="20"/>
-        </w:rPr>
-        <w:t xml:space="preserve">Q: </w:t>
-      </w:r>
-      <w:r>
-        <w:rPr>
-          <w:b/>
-          <w:color w:val="0A1F33"/>
-          <w:sz w:val="20"/>
-        </w:rPr>
-        <w:t>What is AI CRM software, and how is it different from a standard CRM?</w:t>
-      </w:r>
-    </w:p>
-    <w:p>
-      <w:pPr>
-        <w:spacing w:after="100"/>
-        <w:jc w:val="both"/>
-      </w:pPr>
-      <w:r>
-        <w:rPr>
-          <w:color w:val="0A1F33"/>
-          <w:sz w:val="20"/>
-        </w:rPr>
-        <w:t>A standard CRM stores and organises customer data. AI CRM software also uses it: it scores leads, flags deals at risk, forecasts what will close, drafts account summaries and suggests the next best action.</w:t>
-      </w:r>
-    </w:p>
-    <w:p>
-      <w:pPr>
-        <w:spacing w:after="40"/>
-        <w:jc w:val="both"/>
-      </w:pPr>
-      <w:r>
-        <w:rPr>
-          <w:b/>
-          <w:color w:val="0A1F33"/>
-          <w:sz w:val="20"/>
-        </w:rPr>
-        <w:t xml:space="preserve">Q: </w:t>
-      </w:r>
-      <w:r>
-        <w:rPr>
-          <w:b/>
-          <w:color w:val="0A1F33"/>
-          <w:sz w:val="20"/>
-        </w:rPr>
-        <w:t>What AI features does an AI-powered sales CRM include?</w:t>
-      </w:r>
-    </w:p>
-    <w:p>
-      <w:pPr>
-        <w:spacing w:after="100"/>
-        <w:jc w:val="both"/>
-      </w:pPr>
-      <w:r>
-        <w:rPr>
-          <w:color w:val="0A1F33"/>
-          <w:sz w:val="20"/>
-        </w:rPr>
-        <w:t>Our AI-powered sales CRM on SugarAI includes lead and opportunity scoring trained on your own won and lost history, at-risk deal alerts, built-in forecasting, drafted summaries and meeting prep, and next-best-action guidance.</w:t>
-      </w:r>
-    </w:p>
-    <w:p>
-      <w:pPr>
-        <w:spacing w:after="40"/>
-        <w:jc w:val="both"/>
-      </w:pPr>
-      <w:r>
-        <w:rPr>
-          <w:b/>
-          <w:color w:val="0A1F33"/>
-          <w:sz w:val="20"/>
-        </w:rPr>
-        <w:t xml:space="preserve">Q: </w:t>
-      </w:r>
-      <w:r>
-        <w:rPr>
-          <w:b/>
-          <w:color w:val="0A1F33"/>
-          <w:sz w:val="20"/>
-        </w:rPr>
-        <w:t>What is SugarAI, and how is it different from Sugar CRM?</w:t>
-      </w:r>
-    </w:p>
-    <w:p>
-      <w:pPr>
-        <w:spacing w:after="100"/>
-        <w:jc w:val="both"/>
-      </w:pPr>
-      <w:r>
-        <w:rPr>
-          <w:color w:val="0A1F33"/>
-          <w:sz w:val="20"/>
-        </w:rPr>
-        <w:t>SugarAI is the intelligent evolution of Sugar CRM. It keeps the sales, service and marketing platform and adds built-in predictive AI that scores leads, flags at-risk deals and drafts account summaries automatically.</w:t>
-      </w:r>
-    </w:p>
-    <w:p>
-      <w:pPr>
-        <w:spacing w:after="40"/>
-        <w:jc w:val="both"/>
-      </w:pPr>
-      <w:r>
-        <w:rPr>
-          <w:b/>
-          <w:color w:val="0A1F33"/>
-          <w:sz w:val="20"/>
-        </w:rPr>
-        <w:t xml:space="preserve">Q: </w:t>
-      </w:r>
-      <w:r>
-        <w:rPr>
-          <w:b/>
-          <w:color w:val="0A1F33"/>
-          <w:sz w:val="20"/>
-        </w:rPr>
-        <w:t>Can SugarAI work if our customer data is incomplete?</w:t>
-      </w:r>
-    </w:p>
-    <w:p>
-      <w:pPr>
-        <w:spacing w:after="100"/>
-        <w:jc w:val="both"/>
-      </w:pPr>
-      <w:r>
-        <w:rPr>
-          <w:color w:val="0A1F33"/>
-          <w:sz w:val="20"/>
-        </w:rPr>
-        <w:t>Yes. SugarAI is built to give useful predictions from partial or ageing records, so you do not need a perfect database before you start.</w:t>
-      </w:r>
-    </w:p>
-    <w:p>
-      <w:pPr>
-        <w:spacing w:after="40"/>
-        <w:jc w:val="both"/>
-      </w:pPr>
-      <w:r>
-        <w:rPr>
-          <w:b/>
-          <w:color w:val="0A1F33"/>
-          <w:sz w:val="20"/>
-        </w:rPr>
-        <w:t xml:space="preserve">Q: </w:t>
-      </w:r>
-      <w:r>
-        <w:rPr>
-          <w:b/>
-          <w:color w:val="0A1F33"/>
-          <w:sz w:val="20"/>
-        </w:rPr>
-        <w:t>Can you connect the CRM to our ERP and other systems?</w:t>
-      </w:r>
-    </w:p>
-    <w:p>
-      <w:pPr>
-        <w:spacing w:after="100"/>
-        <w:jc w:val="both"/>
-      </w:pPr>
-      <w:r>
-        <w:rPr>
-          <w:color w:val="0A1F33"/>
-          <w:sz w:val="20"/>
-        </w:rPr>
-        <w:t>Yes. We connect SugarAI with ERP and finance platforms, your website, email and marketing tools, so data moves between systems automatically and the AI works from complete records.</w:t>
-      </w:r>
-    </w:p>
-    <w:p>
-      <w:pPr>
-        <w:spacing w:after="40"/>
-        <w:jc w:val="both"/>
-      </w:pPr>
-      <w:r>
-        <w:rPr>
-          <w:b/>
-          <w:color w:val="0A1F33"/>
-          <w:sz w:val="20"/>
-        </w:rPr>
-        <w:t xml:space="preserve">Q: </w:t>
-      </w:r>
-      <w:r>
-        <w:rPr>
-          <w:b/>
-          <w:color w:val="0A1F33"/>
-          <w:sz w:val="20"/>
-        </w:rPr>
-        <w:t>Can we keep our data in the UAE or on our own servers?</w:t>
-      </w:r>
-    </w:p>
-    <w:p>
-      <w:pPr>
-        <w:spacing w:after="100"/>
-        <w:jc w:val="both"/>
-      </w:pPr>
-      <w:r>
-        <w:rPr>
-          <w:color w:val="0A1F33"/>
-          <w:sz w:val="20"/>
-        </w:rPr>
-        <w:t>Yes. You can host on the cloud with regional hosting, deploy into your own Azure, AWS or Oracle Cloud subscription, or install on-premise in your own data centre. Groups often mix models, and it is the same product and team either way.</w:t>
-      </w:r>
-    </w:p>
-    <w:p>
-      <w:pPr>
-        <w:spacing w:after="120"/>
-      </w:pPr>
-    </w:p>
-    <w:p>
-      <w:pPr>
-        <w:pStyle w:val="Heading1"/>
-        <w:keepNext/>
-      </w:pPr>
-      <w:r>
-        <w:t>14. Closing CTA</w:t>
+        <w:t xml:space="preserve">FAQ: </w:t>
+      </w:r>
+      <w:r>
+        <w:rPr>
+          <w:color w:val="0A1F33"/>
+          <w:sz w:val="20"/>
+        </w:rPr>
+        <w:t>Cut from nine questions to six. Removed: Why does a UAE business need an AI CRM, difference between CRM software, services and solution, customised for our industry, support after go-live. Added: keeping data in the UAE or on your own servers.</w:t>
       </w:r>
     </w:p>
     <w:p>
@@ -5950,215 +6159,6 @@
           <w:color w:val="0A1F33"/>
           <w:sz w:val="20"/>
         </w:rPr>
-        <w:t xml:space="preserve">H2: </w:t>
-      </w:r>
-      <w:r>
-        <w:rPr>
-          <w:color w:val="0A1F33"/>
-          <w:sz w:val="20"/>
-        </w:rPr>
-        <w:t>Ready to See an AI CRM on Your Own Pipeline?</w:t>
-      </w:r>
-    </w:p>
-    <w:p>
-      <w:pPr>
-        <w:pStyle w:val="ListParagraph"/>
-        <w:numPr>
-          <w:ilvl w:val="0"/>
-          <w:numId w:val="2"/>
-        </w:numPr>
-        <w:spacing w:after="120"/>
-        <w:jc w:val="both"/>
-      </w:pPr>
-      <w:r>
-        <w:rPr>
-          <w:b/>
-          <w:color w:val="0A1F33"/>
-          <w:sz w:val="20"/>
-        </w:rPr>
-        <w:t xml:space="preserve">Body: </w:t>
-      </w:r>
-      <w:r>
-        <w:rPr>
-          <w:color w:val="0A1F33"/>
-          <w:sz w:val="20"/>
-        </w:rPr>
-        <w:t>Book a free consultation and we will show you AI lead scoring, forecasting and summaries on your kind of data.</w:t>
-      </w:r>
-    </w:p>
-    <w:p>
-      <w:pPr>
-        <w:pStyle w:val="ListParagraph"/>
-        <w:numPr>
-          <w:ilvl w:val="0"/>
-          <w:numId w:val="2"/>
-        </w:numPr>
-        <w:spacing w:after="120"/>
-        <w:jc w:val="both"/>
-      </w:pPr>
-      <w:r>
-        <w:rPr>
-          <w:b/>
-          <w:color w:val="0A1F33"/>
-          <w:sz w:val="20"/>
-        </w:rPr>
-        <w:t xml:space="preserve">Button: </w:t>
-      </w:r>
-      <w:r>
-        <w:rPr>
-          <w:color w:val="0A1F33"/>
-          <w:sz w:val="20"/>
-        </w:rPr>
-        <w:t>Book a free consultation (scrolls to the hero form)</w:t>
-      </w:r>
-    </w:p>
-    <w:p>
-      <w:pPr>
-        <w:pStyle w:val="ListParagraph"/>
-        <w:numPr>
-          <w:ilvl w:val="0"/>
-          <w:numId w:val="2"/>
-        </w:numPr>
-        <w:spacing w:after="120"/>
-        <w:jc w:val="both"/>
-      </w:pPr>
-      <w:r>
-        <w:rPr>
-          <w:b/>
-          <w:color w:val="0A1F33"/>
-          <w:sz w:val="20"/>
-        </w:rPr>
-        <w:t xml:space="preserve">Phone line: </w:t>
-      </w:r>
-      <w:r>
-        <w:rPr>
-          <w:color w:val="0A1F33"/>
-          <w:sz w:val="20"/>
-        </w:rPr>
-        <w:t>Or call us on +971 4 32 77 775 (tap-to-call)</w:t>
-      </w:r>
-    </w:p>
-    <w:p>
-      <w:pPr>
-        <w:spacing w:after="80"/>
-        <w:jc w:val="both"/>
-      </w:pPr>
-      <w:r>
-        <w:rPr>
-          <w:color w:val="0A1F33"/>
-          <w:sz w:val="20"/>
-        </w:rPr>
-        <w:t>Optional: add a short form here (Name, Email, Phone) using the site form component, so visitors at the bottom of the page can convert without scrolling back up.</w:t>
-      </w:r>
-    </w:p>
-    <w:p>
-      <w:pPr>
-        <w:spacing w:after="120"/>
-      </w:pPr>
-    </w:p>
-    <w:p>
-      <w:pPr>
-        <w:pStyle w:val="Heading1"/>
-        <w:keepNext/>
-      </w:pPr>
-      <w:r>
-        <w:t>15. What Changed and What Was Removed</w:t>
-      </w:r>
-    </w:p>
-    <w:p>
-      <w:pPr>
-        <w:pStyle w:val="ListParagraph"/>
-        <w:numPr>
-          <w:ilvl w:val="0"/>
-          <w:numId w:val="2"/>
-        </w:numPr>
-        <w:spacing w:after="120"/>
-        <w:jc w:val="both"/>
-      </w:pPr>
-      <w:r>
-        <w:rPr>
-          <w:b/>
-          <w:color w:val="0A1F33"/>
-          <w:sz w:val="20"/>
-        </w:rPr>
-        <w:t xml:space="preserve">Removed sections: </w:t>
-      </w:r>
-      <w:r>
-        <w:rPr>
-          <w:color w:val="0A1F33"/>
-          <w:sz w:val="20"/>
-        </w:rPr>
-        <w:t>CRM Types, CRM Reimplementation and its CTA, and the "CRM Types" navigation link.</w:t>
-      </w:r>
-    </w:p>
-    <w:p>
-      <w:pPr>
-        <w:pStyle w:val="ListParagraph"/>
-        <w:numPr>
-          <w:ilvl w:val="0"/>
-          <w:numId w:val="2"/>
-        </w:numPr>
-        <w:spacing w:after="120"/>
-        <w:jc w:val="both"/>
-      </w:pPr>
-      <w:r>
-        <w:rPr>
-          <w:b/>
-          <w:color w:val="0A1F33"/>
-          <w:sz w:val="20"/>
-        </w:rPr>
-        <w:t xml:space="preserve">Industry section: </w:t>
-      </w:r>
-      <w:r>
-        <w:rPr>
-          <w:color w:val="0A1F33"/>
-          <w:sz w:val="20"/>
-        </w:rPr>
-        <w:t>Flip cards with descriptions replaced by plain name tiles with the same photos.</w:t>
-      </w:r>
-    </w:p>
-    <w:p>
-      <w:pPr>
-        <w:pStyle w:val="ListParagraph"/>
-        <w:numPr>
-          <w:ilvl w:val="0"/>
-          <w:numId w:val="2"/>
-        </w:numPr>
-        <w:spacing w:after="120"/>
-        <w:jc w:val="both"/>
-      </w:pPr>
-      <w:r>
-        <w:rPr>
-          <w:b/>
-          <w:color w:val="0A1F33"/>
-          <w:sz w:val="20"/>
-        </w:rPr>
-        <w:t xml:space="preserve">FAQ: </w:t>
-      </w:r>
-      <w:r>
-        <w:rPr>
-          <w:color w:val="0A1F33"/>
-          <w:sz w:val="20"/>
-        </w:rPr>
-        <w:t>Cut from nine questions to six. Removed: Why does a UAE business need an AI CRM, difference between CRM software, services and solution, customised for our industry, support after go-live. Added: keeping data in the UAE or on your own servers.</w:t>
-      </w:r>
-    </w:p>
-    <w:p>
-      <w:pPr>
-        <w:pStyle w:val="ListParagraph"/>
-        <w:numPr>
-          <w:ilvl w:val="0"/>
-          <w:numId w:val="2"/>
-        </w:numPr>
-        <w:spacing w:after="120"/>
-        <w:jc w:val="both"/>
-      </w:pPr>
-      <w:r>
-        <w:rPr>
-          <w:b/>
-          <w:color w:val="0A1F33"/>
-          <w:sz w:val="20"/>
-        </w:rPr>
         <w:t xml:space="preserve">Reordered: </w:t>
       </w:r>
       <w:r>
@@ -6166,7 +6166,7 @@
           <w:color w:val="0A1F33"/>
           <w:sz w:val="20"/>
         </w:rPr>
-        <w:t>Offerings moved after the first CTA. Deployment moved after the second CTA.</w:t>
+        <w:t>Offerings moved after the first CTA. Why Choose moved to the middle of the page, after How We Deliver. Deployment moved after the second CTA.</w:t>
       </w:r>
     </w:p>
     <w:p>

</xml_diff>

<commit_message>
Add closing lead form to the AI CRM landing page (HTML, preview, doc)
Co-Authored-By: Claude Sonnet 5.5 <noreply@anthropic.com>
Claude-Session: https://claude.ai/code/session_01EvNjF6Z24XTpLixWRFRe99
</commit_message>
<xml_diff>
--- a/crm-page/ai-crm-landing-page-content.docx
+++ b/crm-page/ai-crm-landing-page-content.docx
@@ -501,7 +501,7 @@
                 <w:color w:val="0A1F33"/>
                 <w:sz w:val="18"/>
               </w:rPr>
-              <w:t>Existing form kept in the hero: Name, Company, Business Email, Country Code, Phone, Project Timeline, Message. Button: Request Free Consultation.</w:t>
+              <w:t>Existing form kept in the hero and repeated in the closing band: Name, Company, Business Email, Country Code, Phone, Project Timeline, Message. Button: Request Free Consultation.</w:t>
             </w:r>
           </w:p>
         </w:tc>
@@ -2482,7 +2482,7 @@
                 <w:color w:val="0A1F33"/>
                 <w:sz w:val="18"/>
               </w:rPr>
-              <w:t>Closing CTA</w:t>
+              <w:t>Closing CTA with form</w:t>
             </w:r>
           </w:p>
         </w:tc>
@@ -5931,7 +5931,7 @@
         <w:keepNext/>
       </w:pPr>
       <w:r>
-        <w:t>14. Closing CTA</w:t>
+        <w:t>14. Closing CTA With Form</w:t>
       </w:r>
     </w:p>
     <w:p>
@@ -6002,14 +6002,14 @@
           <w:color w:val="0A1F33"/>
           <w:sz w:val="20"/>
         </w:rPr>
-        <w:t xml:space="preserve">Button: </w:t>
-      </w:r>
-      <w:r>
-        <w:rPr>
-          <w:color w:val="0A1F33"/>
-          <w:sz w:val="20"/>
-        </w:rPr>
-        <w:t>Book a free consultation (scrolls to the hero form)</w:t>
+        <w:t xml:space="preserve">Form: </w:t>
+      </w:r>
+      <w:r>
+        <w:rPr>
+          <w:color w:val="0A1F33"/>
+          <w:sz w:val="20"/>
+        </w:rPr>
+        <w:t>The same lead form as the hero (Name, Company, Business Email, Country Code, Phone, Project Timeline, Message), placed in the closing band. It submits to the same form settings and lead inbox as the hero form. Button: Request Free Consultation.</w:t>
       </w:r>
     </w:p>
     <w:p>
@@ -6040,19 +6040,6 @@
     </w:p>
     <w:p>
       <w:pPr>
-        <w:spacing w:after="80"/>
-        <w:jc w:val="both"/>
-      </w:pPr>
-      <w:r>
-        <w:rPr>
-          <w:color w:val="0A1F33"/>
-          <w:sz w:val="20"/>
-        </w:rPr>
-        <w:t>Optional: add a short form here (Name, Email, Phone) using the site form component, so visitors at the bottom of the page can convert without scrolling back up.</w:t>
-      </w:r>
-    </w:p>
-    <w:p>
-      <w:pPr>
         <w:spacing w:after="120"/>
       </w:pPr>
     </w:p>
@@ -6192,7 +6179,7 @@
           <w:color w:val="0A1F33"/>
           <w:sz w:val="20"/>
         </w:rPr>
-        <w:t>Trust strip, benefit bullets in the hero, one H1, a closing CTA, and working links on every CTA button.</w:t>
+        <w:t>Trust strip, benefit bullets in the hero, one H1, a closing CTA band with the lead form, and working links on every CTA button.</w:t>
       </w:r>
     </w:p>
     <w:p>

</xml_diff>